<commit_message>
Fix JA manuscript: remove duplicated Discussion sentence + add CSLC limitation caveat
- Discussion opening: remove duplicated '本研究は...初めての研究である。' sentence
  that was repeated when the expanded replacement was appended
- Limitations: add CSLC caveat (有訴者率 is general, not pain-specific, but
  musculoskeletal pain is most common complaint) — mirrors EN version

Co-Authored-By: Tatsuki Onishi <bougtoir@gmail.com>
</commit_message>
<xml_diff>
--- a/ndb-pain-regional-variation-japan/output/je/JE_manuscript_JA.docx
+++ b/ndb-pain-regional-variation-japan/output/je/JE_manuscript_JA.docx
@@ -1786,7 +1786,7 @@
     </w:p>
     <w:p>
       <w:r>
-        <w:t>本研究は、NDBオープンデータを用いて、日本の47都道府県すべてにおける周術期および慢性疼痛関連処方をマッピングした初めての研究である。NDBオープンデータを用いて、日本の47都道府県すべてにおける周術期および慢性疼痛関連処方をマッピングした初めての研究であり、独立した需要側指標との対照によりWennbergの不当な差異の基準を満たすか否かを正式に評価した初めての研究でもある。4つの主要な知見が得られた。</w:t>
+        <w:t>本研究は、NDBオープンデータを用いて、日本の47都道府県すべてにおける周術期および慢性疼痛関連処方をマッピングした初めての研究であり、独立した需要側指標との対照によりWennbergの不当な差異の基準を満たすか否かを正式に評価した初めての研究でもある。4つの主要な知見が得られた。</w:t>
       </w:r>
     </w:p>
     <w:p>
@@ -1966,7 +1966,7 @@
     </w:p>
     <w:p>
       <w:r>
-        <w:t>限界は生態学的デザインに固有のものである。分析単位は都道府県であり個人ではなく、生態学的相関は個体レベルの関連を反映しない可能性がある（生態学的誤謬）。NDBオープンデータは診断コードを欠くため、神経障害性疼痛薬プロキシはCPSP以外の全適応を捕捉する。手術症例構成や医師密度などの未測定交絡因子が残存差異に寄与する可能性がある。</w:t>
+        <w:t>限界は生態学的デザインに固有のものである。分析単位は都道府県であり個人ではなく、生態学的相関は個体レベルの関連を反映しない可能性がある（生態学的誤謬）。NDBオープンデータは診断コードを欠くため、神経障害性疼痛薬プロキシはCPSP以外の全適応を捕捉する。手術症例構成や医師密度などの未測定交絡因子が残存差異に寄与する可能性がある。CSLCの有訴者率は疼痛に特異的ではなく自覚症状全般の指標であるが、全国的に筋骨格系疼痛症状（腰痛・肩こり）が最多の訴えであり、疼痛関連需要の合理的な生態学的プロキシとして機能する。</w:t>
       </w:r>
     </w:p>
     <w:p>

</xml_diff>